<commit_message>
Restore resume before separate AI section
</commit_message>
<xml_diff>
--- a/assets/Aditya-Dubey-Resume.docx
+++ b/assets/Aditya-Dubey-Resume.docx
@@ -80,7 +80,7 @@
         <w:rPr>
           <w:b w:val="0"/>
         </w:rPr>
-        <w:t>Java/Spring Boot Software Developer at Oracle with 3+ years in banking. Delivered 15+ APIs for HDFC Bank, managed Kubernetes for 60+ APIs, and led migration of nearly 50 million customer records.</w:t>
+        <w:t>Software Developer with 3+ years at Oracle building Java and Spring Boot applications for HDFC Bank. Delivered 15+ core banking REST APIs, managed Kubernetes infrastructure for 60+ APIs, and led migration of nearly 50 million customer records.</w:t>
       </w:r>
     </w:p>
     <w:p>
@@ -206,6 +206,23 @@
     </w:p>
     <w:p>
       <w:pPr>
+        <w:keepLines/>
+        <w:spacing w:after="60"/>
+        <w:ind w:left="216" w:hanging="180"/>
+        <w:numPr>
+          <w:ilvl w:val="0"/>
+          <w:numId w:val="42"/>
+        </w:numPr>
+      </w:pPr>
+      <w:r>
+        <w:rPr>
+          <w:b w:val="0"/>
+        </w:rPr>
+        <w:t>Designed Codex agents for regression testing, commit preparation, UI validation, and detecting potentially unused Java logic; reviewed findings before integrating changes.</w:t>
+      </w:r>
+    </w:p>
+    <w:p>
+      <w:pPr>
         <w:pStyle w:val="Heading2"/>
         <w:pBdr>
           <w:bottom w:val="single" w:sz="6" w:space="2" w:color="000000"/>
@@ -267,7 +284,7 @@
         <w:rPr>
           <w:b w:val="0"/>
         </w:rPr>
-        <w:t>Enforced branch-screen validations in backend services; implemented request/response mappings, OpenAPI contracts, duplicate checks, timeouts, rollback, and auditing.</w:t>
+        <w:t>Enforced branch-screen validations in backend services; standardized API scaffolding with Codex and implemented request/response mappings, OpenAPI contracts, duplicate checks, timeouts, rollback, and auditing.</w:t>
       </w:r>
     </w:p>
     <w:p>
@@ -334,61 +351,6 @@
           <w:b w:val="0"/>
         </w:rPr>
         <w:t>Developed full-stack beneficiary-name verification for IMPS, NEFT, and RTGS with NPCI integration, retries, and matching. Delivered bulk user-blocking and Multiple Nomination features; mentored two engineers.</w:t>
-      </w:r>
-    </w:p>
-    <w:p>
-      <w:pPr>
-        <w:pStyle w:val="Heading2"/>
-        <w:pBdr>
-          <w:bottom w:val="single" w:sz="6" w:space="2" w:color="000000"/>
-        </w:pBdr>
-        <w:spacing w:after="80"/>
-      </w:pPr>
-      <w:r>
-        <w:rPr>
-          <w:b/>
-        </w:rPr>
-        <w:t>AI-Assisted Development</w:t>
-      </w:r>
-    </w:p>
-    <w:p>
-      <w:pPr>
-        <w:keepLines/>
-        <w:spacing w:after="60"/>
-        <w:ind w:left="216" w:hanging="180"/>
-        <w:numPr>
-          <w:ilvl w:val="0"/>
-          <w:numId w:val="42"/>
-        </w:numPr>
-      </w:pPr>
-      <w:r>
-        <w:rPr>
-          <w:b/>
-        </w:rPr>
-        <w:t xml:space="preserve">AI agents: </w:t>
-      </w:r>
-      <w:r>
-        <w:t>Designed Codex agents for regression testing, UI validation, commit preparation, and identifying potentially unused Java logic.</w:t>
-      </w:r>
-    </w:p>
-    <w:p>
-      <w:pPr>
-        <w:keepLines/>
-        <w:spacing w:after="60"/>
-        <w:ind w:left="216" w:hanging="180"/>
-        <w:numPr>
-          <w:ilvl w:val="0"/>
-          <w:numId w:val="42"/>
-        </w:numPr>
-      </w:pPr>
-      <w:r>
-        <w:rPr>
-          <w:b/>
-        </w:rPr>
-        <w:t xml:space="preserve">Development automation: </w:t>
-      </w:r>
-      <w:r>
-        <w:t>Standardized Java API scaffolding with Codex, then reviewed generated code, request/response mappings, and banking validations before integration.</w:t>
       </w:r>
     </w:p>
     <w:p>

</xml_diff>